<commit_message>
Additional fixes and updates business Rules
</commit_message>
<xml_diff>
--- a/docs/Entities_and_Business_Rules.docx
+++ b/docs/Entities_and_Business_Rules.docx
@@ -19,83 +19,48 @@
       </w:r>
     </w:p>
     <w:p>
-      <w:pPr>
-        <w:pStyle w:val="ListBullet"/>
-      </w:pPr>
       <w:r>
         <w:t>User</w:t>
       </w:r>
     </w:p>
     <w:p>
-      <w:pPr>
-        <w:pStyle w:val="ListBullet"/>
-      </w:pPr>
       <w:r>
         <w:t>User Profile</w:t>
       </w:r>
     </w:p>
     <w:p>
-      <w:pPr>
-        <w:pStyle w:val="ListBullet"/>
-      </w:pPr>
       <w:r>
         <w:t>Company</w:t>
       </w:r>
     </w:p>
     <w:p>
-      <w:pPr>
-        <w:pStyle w:val="ListBullet"/>
-      </w:pPr>
       <w:r>
         <w:t>Opportunity (Base Entity)</w:t>
       </w:r>
     </w:p>
     <w:p>
-      <w:pPr>
-        <w:pStyle w:val="ListBullet"/>
-      </w:pPr>
       <w:r>
-        <w:t xml:space="preserve">  - Internship</w:t>
+        <w:t>- Internship</w:t>
       </w:r>
     </w:p>
     <w:p>
-      <w:pPr>
-        <w:pStyle w:val="ListBullet"/>
-      </w:pPr>
       <w:r>
-        <w:t xml:space="preserve">  - Job</w:t>
+        <w:t>- Job</w:t>
       </w:r>
     </w:p>
     <w:p>
-      <w:pPr>
-        <w:pStyle w:val="ListBullet"/>
-      </w:pPr>
       <w:r>
         <w:t>Application</w:t>
       </w:r>
     </w:p>
     <w:p>
-      <w:pPr>
-        <w:pStyle w:val="ListBullet"/>
-      </w:pPr>
       <w:r>
         <w:t>Skill</w:t>
       </w:r>
     </w:p>
     <w:p>
-      <w:pPr>
-        <w:pStyle w:val="ListBullet"/>
-      </w:pPr>
       <w:r>
         <w:t>Experience</w:t>
-      </w:r>
-    </w:p>
-    <w:p>
-      <w:pPr>
-        <w:pStyle w:val="ListBullet"/>
-      </w:pPr>
-      <w:r>
-        <w:t>Notification</w:t>
       </w:r>
     </w:p>
     <w:p>
@@ -107,25 +72,16 @@
       </w:r>
     </w:p>
     <w:p>
-      <w:pPr>
-        <w:pStyle w:val="ListBullet"/>
-      </w:pPr>
       <w:r>
         <w:t>ADMIN</w:t>
       </w:r>
     </w:p>
     <w:p>
-      <w:pPr>
-        <w:pStyle w:val="ListBullet"/>
-      </w:pPr>
       <w:r>
         <w:t>COMPANY</w:t>
       </w:r>
     </w:p>
     <w:p>
-      <w:pPr>
-        <w:pStyle w:val="ListBullet"/>
-      </w:pPr>
       <w:r>
         <w:t>USER</w:t>
       </w:r>
@@ -135,7 +91,7 @@
         <w:pStyle w:val="Heading2"/>
       </w:pPr>
       <w:r>
-        <w:t>Business Rules</w:t>
+        <w:t>Business Rules (Updated to Match the Current Implementation)</w:t>
       </w:r>
     </w:p>
     <w:p>
@@ -143,15 +99,7 @@
         <w:pStyle w:val="ListBullet"/>
       </w:pPr>
       <w:r>
-        <w:t>Only STUDENT and FRESH_GRAD users can apply for internships.</w:t>
-      </w:r>
-    </w:p>
-    <w:p>
-      <w:pPr>
-        <w:pStyle w:val="ListBullet"/>
-      </w:pPr>
-      <w:r>
-        <w:t>Only FRESH_GRAD, JUNIOR, MID_LEVEL, and SENIOR users can apply for jobs.</w:t>
+        <w:t>Only authenticated users with the USER role can apply for opportunities.</w:t>
       </w:r>
     </w:p>
     <w:p>
@@ -167,7 +115,7 @@
         <w:pStyle w:val="ListBullet"/>
       </w:pPr>
       <w:r>
-        <w:t>Users cannot apply after the application's deadline.</w:t>
+        <w:t>Applications are only allowed for opportunities that are not CLOSED.</w:t>
       </w:r>
     </w:p>
     <w:p>
@@ -175,7 +123,7 @@
         <w:pStyle w:val="ListBullet"/>
       </w:pPr>
       <w:r>
-        <w:t>Companies can manually stop accepting applications before the deadline.</w:t>
+        <w:t>A user must have a profile before applying for an opportunity.</w:t>
       </w:r>
     </w:p>
     <w:p>
@@ -183,7 +131,7 @@
         <w:pStyle w:val="ListBullet"/>
       </w:pPr>
       <w:r>
-        <w:t>Opportunities stop accepting applications once the maximum number of applicants is reached.</w:t>
+        <w:t>New applications are created with PENDING status.</w:t>
       </w:r>
     </w:p>
     <w:p>
@@ -191,7 +139,7 @@
         <w:pStyle w:val="ListBullet"/>
       </w:pPr>
       <w:r>
-        <w:t>Only approved companies can publish opportunities.</w:t>
+        <w:t>Application status can be updated to ACCEPTED or REJECTED by the owning company.</w:t>
       </w:r>
     </w:p>
     <w:p>
@@ -199,7 +147,7 @@
         <w:pStyle w:val="ListBullet"/>
       </w:pPr>
       <w:r>
-        <w:t>Companies can only manage their own opportunities.</w:t>
+        <w:t>Companies can only manage opportunities they own.</w:t>
       </w:r>
     </w:p>
     <w:p>
@@ -207,7 +155,7 @@
         <w:pStyle w:val="ListBullet"/>
       </w:pPr>
       <w:r>
-        <w:t>Users must complete their profile before applying.</w:t>
+        <w:t>Companies can retrieve applications for their own opportunities.</w:t>
       </w:r>
     </w:p>
     <w:p>
@@ -215,7 +163,7 @@
         <w:pStyle w:val="ListBullet"/>
       </w:pPr>
       <w:r>
-        <w:t>A completed profile includes personal information, education, skills, and experience (experience is optional for STUDENT profiles).</w:t>
+        <w:t>Only ADMIN users can create company accounts.</w:t>
       </w:r>
     </w:p>
     <w:p>
@@ -223,7 +171,7 @@
         <w:pStyle w:val="ListBullet"/>
       </w:pPr>
       <w:r>
-        <w:t>Opportunities can specify required skills.</w:t>
+        <w:t>Each user can have only one profile.</w:t>
       </w:r>
     </w:p>
     <w:p>
@@ -231,7 +179,7 @@
         <w:pStyle w:val="ListBullet"/>
       </w:pPr>
       <w:r>
-        <w:t>Companies can only update the status of applications submitted to their own opportunities.</w:t>
+        <w:t>Only USER accounts can create and update their own profile.</w:t>
       </w:r>
     </w:p>
     <w:p>
@@ -239,7 +187,7 @@
         <w:pStyle w:val="ListBullet"/>
       </w:pPr>
       <w:r>
-        <w:t>Companies can filter applicants by skills or experience title.</w:t>
+        <w:t>Jobs and Internships are specialized Opportunity entities.</w:t>
       </w:r>
     </w:p>
     <w:p>
@@ -247,7 +195,7 @@
         <w:pStyle w:val="ListBullet"/>
       </w:pPr>
       <w:r>
-        <w:t>The system can rank applicants and return the Top K matching candidates based on skills and relevant experience.</w:t>
+        <w:t>All opportunity, company, and profile lookups return an error when the resource does not exist.</w:t>
       </w:r>
     </w:p>
     <w:p>
@@ -255,15 +203,7 @@
         <w:pStyle w:val="ListBullet"/>
       </w:pPr>
       <w:r>
-        <w:t>Whenever an application is ACCEPTED or REJECTED, the system automatically creates a notification for the applicant.</w:t>
-      </w:r>
-    </w:p>
-    <w:p>
-      <w:pPr>
-        <w:pStyle w:val="ListBullet"/>
-      </w:pPr>
-      <w:r>
-        <w:t>Closed opportunities cannot receive new applications.</w:t>
+        <w:t>Duplicate email addresses are not allowed when creating companies.</w:t>
       </w:r>
     </w:p>
     <w:p>
@@ -287,7 +227,7 @@
         <w:pStyle w:val="ListBullet"/>
       </w:pPr>
       <w:r>
-        <w:t>Approve or reject companies.</w:t>
+        <w:t>Create company accounts.</w:t>
       </w:r>
     </w:p>
     <w:p>
@@ -295,15 +235,7 @@
         <w:pStyle w:val="ListBullet"/>
       </w:pPr>
       <w:r>
-        <w:t>Manage users and companies.</w:t>
-      </w:r>
-    </w:p>
-    <w:p>
-      <w:pPr>
-        <w:pStyle w:val="ListBullet"/>
-      </w:pPr>
-      <w:r>
-        <w:t>View all opportunities and applications.</w:t>
+        <w:t>View company information.</w:t>
       </w:r>
     </w:p>
     <w:p>
@@ -319,7 +251,7 @@
         <w:pStyle w:val="ListBullet"/>
       </w:pPr>
       <w:r>
-        <w:t>Create, edit, and close its own opportunities.</w:t>
+        <w:t>Create jobs and internships.</w:t>
       </w:r>
     </w:p>
     <w:p>
@@ -327,7 +259,7 @@
         <w:pStyle w:val="ListBullet"/>
       </w:pPr>
       <w:r>
-        <w:t>View applications submitted to its opportunities.</w:t>
+        <w:t>View its own opportunities.</w:t>
       </w:r>
     </w:p>
     <w:p>
@@ -335,7 +267,7 @@
         <w:pStyle w:val="ListBullet"/>
       </w:pPr>
       <w:r>
-        <w:t>Filter applicants by skills or experience title.</w:t>
+        <w:t>View applications for its opportunities.</w:t>
       </w:r>
     </w:p>
     <w:p>
@@ -343,15 +275,7 @@
         <w:pStyle w:val="ListBullet"/>
       </w:pPr>
       <w:r>
-        <w:t>View Top K matching applicants.</w:t>
-      </w:r>
-    </w:p>
-    <w:p>
-      <w:pPr>
-        <w:pStyle w:val="ListBullet"/>
-      </w:pPr>
-      <w:r>
-        <w:t>Accept or reject applications.</w:t>
+        <w:t>Update application status.</w:t>
       </w:r>
     </w:p>
     <w:p>
@@ -367,7 +291,7 @@
         <w:pStyle w:val="ListBullet"/>
       </w:pPr>
       <w:r>
-        <w:t>Complete profile.</w:t>
+        <w:t>Create and update profile.</w:t>
       </w:r>
     </w:p>
     <w:p>
@@ -375,7 +299,7 @@
         <w:pStyle w:val="ListBullet"/>
       </w:pPr>
       <w:r>
-        <w:t>Edit profile.</w:t>
+        <w:t>Apply for opportunities.</w:t>
       </w:r>
     </w:p>
     <w:p>
@@ -383,7 +307,7 @@
         <w:pStyle w:val="ListBullet"/>
       </w:pPr>
       <w:r>
-        <w:t>Add skills.</w:t>
+        <w:t>View own applications.</w:t>
       </w:r>
     </w:p>
     <w:p>
@@ -391,39 +315,7 @@
         <w:pStyle w:val="ListBullet"/>
       </w:pPr>
       <w:r>
-        <w:t>Add experiences.</w:t>
-      </w:r>
-    </w:p>
-    <w:p>
-      <w:pPr>
-        <w:pStyle w:val="ListBullet"/>
-      </w:pPr>
-      <w:r>
-        <w:t>Search opportunities.</w:t>
-      </w:r>
-    </w:p>
-    <w:p>
-      <w:pPr>
-        <w:pStyle w:val="ListBullet"/>
-      </w:pPr>
-      <w:r>
-        <w:t>Apply for eligible opportunities.</w:t>
-      </w:r>
-    </w:p>
-    <w:p>
-      <w:pPr>
-        <w:pStyle w:val="ListBullet"/>
-      </w:pPr>
-      <w:r>
-        <w:t>View application status.</w:t>
-      </w:r>
-    </w:p>
-    <w:p>
-      <w:pPr>
-        <w:pStyle w:val="ListBullet"/>
-      </w:pPr>
-      <w:r>
-        <w:t>Receive notifications.</w:t>
+        <w:t>Browse opportunities.</w:t>
       </w:r>
     </w:p>
     <w:sectPr>

</xml_diff>